<commit_message>
chore: drop the skills.sh copies, keep the plugin as the only install
grilling, grill-me and domain-modeling existed twice: once from the
mattpocock-skills plugin, once as skills.sh copies under .agents/skills
symlinked into .claude/skills. Removes the copies, their symlinks and
skills-lock.json; the plugin in .claude/settings.json still provides the
full set, and docs/agents/ (the /setup-matt-pocock-skills answers) is
unaffected.

Section 11 of the Word guide is rewritten for the single-install setup —
it also claimed all three skills were symlinked, which domain-modeling
never was.

Co-Authored-By: Claude Opus 5 <noreply@anthropic.com>
</commit_message>
<xml_diff>
--- a/docs/Скиллы_mattpocock_конвейер.docx
+++ b/docs/Скиллы_mattpocock_конвейер.docx
@@ -3245,7 +3245,7 @@
     </w:p>
     <w:p>
       <w:r>
-        <w:t>Скиллы поставлены двумя способами сразу, и это стоит держать в голове:</w:t>
+        <w:t>Скиллы поставлены одним способом — плагином:</w:t>
       </w:r>
     </w:p>
     <w:p>
@@ -3259,7 +3259,7 @@
         <w:t xml:space="preserve">Плагин </w:t>
       </w:r>
       <w:r>
-        <w:t>mattpocock-skills@claude-plugins-official (включён в .claude/settings.json) — весь набор из 35 скиллов, обновляется сам, править нельзя.</w:t>
+        <w:t>mattpocock-skills@claude-plugins-official, включён в .claude/settings.json. Это весь набор из 35 скиллов; он обновляется сам, файлы лежат в кеше плагинов и правке не подлежат.</w:t>
       </w:r>
     </w:p>
     <w:p>
@@ -3270,10 +3270,10 @@
         <w:rPr>
           <w:b/>
         </w:rPr>
-        <w:t xml:space="preserve">Копии через skills.sh </w:t>
+        <w:t xml:space="preserve">Локальных копий нет. </w:t>
       </w:r>
       <w:r>
-        <w:t>— три скилла лежат файлами в .agents/skills/ (grilling, grill-me, domain-modeling) и подставлены симлинками в .claude/skills/. Версии зафиксированы хешами в skills-lock.json, обновление — npx skills update.</w:t>
+        <w:t>Раньше три скилла (grilling, grill-me, domain-modeling) дополнительно лежали файлами в .agents/skills/ — установка через skills.sh — и подставлялись симлинками в .claude/skills/. От этой схемы отказались: она дублировала ровно те же скиллы, что уже даёт плагин.</w:t>
       </w:r>
     </w:p>
     <w:p>
@@ -3285,7 +3285,7 @@
         <w:rPr>
           <w:sz w:val="20"/>
         </w:rPr>
-        <w:t>Из-за двойной установки grilling, grill-me и domain-modeling существуют в двух экземплярах. Сам автор рекомендует выбрать что-то одно. Локальные копии имеет смысл держать только если вы правите их под проект — иначе проще удалить .agents/skills и skills-lock.json и жить на плагине.</w:t>
+        <w:t>Если понадобится править скилл под проект, локальную копию возвращают командой npx skills@latest add mattpocock/skills — но тогда одноимённые скиллы снова начнут существовать в двух экземплярах, чего сам автор набора советует избегать. Выбирайте что-то одно.</w:t>
       </w:r>
     </w:p>
     <w:p>
@@ -3295,7 +3295,12 @@
     </w:p>
     <w:p>
       <w:r>
-        <w:t>Плюс в репозитории есть два собственных скилла, не связанных с набором Мэтта: /run-app (как поднять приложение локально) и /run-tests (как гонять pytest). /implement и /tdd опираются на них, когда нужно проверить работу вживую.</w:t>
+        <w:t>Настройки, сделанные скиллом /setup-matt-pocock-skills, живут отдельно от самих скиллов — в docs/agents/ — и удаления локальных копий не касаются.</w:t>
+      </w:r>
+    </w:p>
+    <w:p>
+      <w:r>
+        <w:t>Плюс в репозитории есть два собственных скилла, не связанных с набором Мэтта: /run-app (как поднять приложение локально) и /run-tests (как гонять pytest). Они лежат в .claude/skills/. /implement и /tdd опираются на них, когда нужно проверить работу вживую.</w:t>
       </w:r>
     </w:p>
     <w:p>

</xml_diff>